<commit_message>
Report: front matter in roman numerals, page numbering starts at Chapter 1
Co-Authored-By: Claude Sonnet 5.5 <noreply@anthropic.com>
Claude-Session: https://claude.ai/code/session_01GSYp4LDgDVFSxSUEwcAheK
</commit_message>
<xml_diff>
--- a/docs/DBMS_Mini_Project_Report.docx
+++ b/docs/DBMS_Mini_Project_Report.docx
@@ -1274,7 +1274,7 @@
           <w:rFonts w:cs="Times New Roman"/>
           <w:szCs w:val="24"/>
         </w:rPr>
-        <w:t>2</w:t>
+        <w:t>ii</w:t>
       </w:r>
       <w:r>
         <w:rPr>
@@ -1331,7 +1331,7 @@
           <w:rFonts w:cs="Times New Roman"/>
           <w:szCs w:val="24"/>
         </w:rPr>
-        <w:t>3</w:t>
+        <w:t>iii</w:t>
       </w:r>
       <w:r>
         <w:rPr>
@@ -1388,7 +1388,7 @@
           <w:rFonts w:cs="Times New Roman"/>
           <w:szCs w:val="24"/>
         </w:rPr>
-        <w:t>4</w:t>
+        <w:t>iv</w:t>
       </w:r>
       <w:r>
         <w:rPr>
@@ -1445,7 +1445,7 @@
           <w:rFonts w:cs="Times New Roman"/>
           <w:szCs w:val="24"/>
         </w:rPr>
-        <w:t>5</w:t>
+        <w:t>v</w:t>
       </w:r>
       <w:r>
         <w:rPr>
@@ -1502,7 +1502,7 @@
           <w:rFonts w:cs="Times New Roman"/>
           <w:szCs w:val="24"/>
         </w:rPr>
-        <w:t>7</w:t>
+        <w:t>1</w:t>
       </w:r>
       <w:r>
         <w:rPr>
@@ -1559,7 +1559,7 @@
           <w:rFonts w:cs="Times New Roman"/>
           <w:szCs w:val="24"/>
         </w:rPr>
-        <w:t>10</w:t>
+        <w:t>4</w:t>
       </w:r>
       <w:r>
         <w:rPr>
@@ -1616,7 +1616,7 @@
           <w:rFonts w:cs="Times New Roman"/>
           <w:szCs w:val="24"/>
         </w:rPr>
-        <w:t>12</w:t>
+        <w:t>6</w:t>
       </w:r>
       <w:r>
         <w:rPr>
@@ -1673,7 +1673,7 @@
           <w:rFonts w:cs="Times New Roman"/>
           <w:szCs w:val="24"/>
         </w:rPr>
-        <w:t>14</w:t>
+        <w:t>8</w:t>
       </w:r>
       <w:r>
         <w:rPr>
@@ -1730,7 +1730,7 @@
           <w:rFonts w:cs="Times New Roman"/>
           <w:szCs w:val="24"/>
         </w:rPr>
-        <w:t>19</w:t>
+        <w:t>13</w:t>
       </w:r>
       <w:r>
         <w:rPr>
@@ -1787,7 +1787,7 @@
           <w:rFonts w:cs="Times New Roman"/>
           <w:szCs w:val="24"/>
         </w:rPr>
-        <w:t>22</w:t>
+        <w:t>16</w:t>
       </w:r>
       <w:r>
         <w:rPr>
@@ -1844,7 +1844,7 @@
           <w:rFonts w:cs="Times New Roman"/>
           <w:szCs w:val="24"/>
         </w:rPr>
-        <w:t>30</w:t>
+        <w:t>24</w:t>
       </w:r>
       <w:r>
         <w:rPr>
@@ -1901,7 +1901,7 @@
           <w:rFonts w:cs="Times New Roman"/>
           <w:szCs w:val="24"/>
         </w:rPr>
-        <w:t>33</w:t>
+        <w:t>27</w:t>
       </w:r>
       <w:r>
         <w:rPr>
@@ -1958,7 +1958,7 @@
           <w:rFonts w:cs="Times New Roman"/>
           <w:szCs w:val="24"/>
         </w:rPr>
-        <w:t>45</w:t>
+        <w:t>39</w:t>
       </w:r>
       <w:r>
         <w:rPr>
@@ -2015,7 +2015,7 @@
           <w:rFonts w:cs="Times New Roman"/>
           <w:szCs w:val="24"/>
         </w:rPr>
-        <w:t>48</w:t>
+        <w:t>42</w:t>
       </w:r>
       <w:r>
         <w:rPr>
@@ -2072,7 +2072,7 @@
           <w:rFonts w:cs="Times New Roman"/>
           <w:szCs w:val="24"/>
         </w:rPr>
-        <w:t>49</w:t>
+        <w:t>43</w:t>
       </w:r>
       <w:r>
         <w:rPr>
@@ -2129,7 +2129,7 @@
           <w:rFonts w:cs="Times New Roman"/>
           <w:szCs w:val="24"/>
         </w:rPr>
-        <w:t>50</w:t>
+        <w:t>44</w:t>
       </w:r>
       <w:r>
         <w:rPr>
@@ -2145,14 +2145,23 @@
           <w:rFonts w:cs="Times New Roman"/>
           <w:szCs w:val="24"/>
         </w:rPr>
-      </w:pPr>
-      <w:r>
-        <w:rPr>
-          <w:rFonts w:cs="Times New Roman"/>
-          <w:szCs w:val="24"/>
-        </w:rPr>
-        <w:br w:type="page"/>
-      </w:r>
+        <w:sectPr>
+          <w:headerReference w:type="default" r:id="rId8"/>
+          <w:footerReference w:type="default" r:id="rId9"/>
+          <w:pgSz w:w="12240" w:h="15840"/>
+          <w:pgMar w:top="1080" w:right="1152" w:bottom="1008" w:left="1152" w:header="720" w:footer="720" w:gutter="0"/>
+          <w:pgBorders w:offsetFrom="page">
+            <w:top w:val="single" w:sz="10" w:space="12" w:color="000000"/>
+            <w:left w:val="single" w:sz="10" w:space="12" w:color="000000"/>
+            <w:bottom w:val="single" w:sz="10" w:space="12" w:color="000000"/>
+            <w:right w:val="single" w:sz="10" w:space="12" w:color="000000"/>
+          </w:pgBorders>
+          <w:pgNumType w:fmt="lowerRoman" w:start="1"/>
+          <w:cols w:space="720"/>
+          <w:titlePg/>
+          <w:docGrid w:linePitch="360"/>
+        </w:sectPr>
+      </w:pPr>
     </w:p>
     <w:p>
       <w:pPr>
@@ -30695,8 +30704,8 @@
         <w:bottom w:val="single" w:sz="10" w:space="12" w:color="000000"/>
         <w:right w:val="single" w:sz="10" w:space="12" w:color="000000"/>
       </w:pgBorders>
+      <w:pgNumType w:start="1"/>
       <w:cols w:space="720"/>
-      <w:titlePg/>
       <w:docGrid w:linePitch="360"/>
     </w:sectPr>
   </w:body>

</xml_diff>